<commit_message>
14-04-2025 | Daily 03 - Sprint 3 | Actualización de Casos de Uso
- Agregado el documento detallado correspondiente al Daily 3.
- Actualizados los casos de uso aceptados hasta el Daily 3, reflejando el progreso del sprint.
</commit_message>
<xml_diff>
--- a/docs/documentacion/Sprint_3/Casos de Prueba - Aceptados Sprint 3.docx
+++ b/docs/documentacion/Sprint_3/Casos de Prueba - Aceptados Sprint 3.docx
@@ -115,16 +115,7 @@
           <w:sz w:val="24"/>
           <w:szCs w:val="24"/>
         </w:rPr>
-        <w:t>Miembros del equipo durante el Sprint 3</w:t>
-      </w:r>
-      <w:r>
-        <w:rPr>
-          <w:b/>
-          <w:color w:val="000000"/>
-          <w:sz w:val="24"/>
-          <w:szCs w:val="24"/>
-        </w:rPr>
-        <w:t>:</w:t>
+        <w:t>Miembros del equipo durante el Sprint 3:</w:t>
       </w:r>
     </w:p>
     <w:tbl>
@@ -1372,10 +1363,12 @@
             </w:pPr>
             <w:r>
               <w:rPr>
-                <w:sz w:val="24"/>
-                <w:szCs w:val="24"/>
-              </w:rPr>
-              <w:t>Pendiente</w:t>
+                <w:b/>
+                <w:bCs/>
+                <w:sz w:val="24"/>
+                <w:szCs w:val="24"/>
+              </w:rPr>
+              <w:t>Finalizado</w:t>
             </w:r>
           </w:p>
         </w:tc>
@@ -1533,10 +1526,12 @@
             </w:pPr>
             <w:r>
               <w:rPr>
-                <w:sz w:val="24"/>
-                <w:szCs w:val="24"/>
-              </w:rPr>
-              <w:t>Pendiente</w:t>
+                <w:b/>
+                <w:bCs/>
+                <w:sz w:val="24"/>
+                <w:szCs w:val="24"/>
+              </w:rPr>
+              <w:t>Finalizado</w:t>
             </w:r>
           </w:p>
         </w:tc>
@@ -1722,11 +1717,13 @@
             </w:pPr>
             <w:r>
               <w:rPr>
+                <w:b/>
+                <w:bCs/>
                 <w:sz w:val="24"/>
                 <w:szCs w:val="24"/>
               </w:rPr>
               <w:lastRenderedPageBreak/>
-              <w:t>Pendiente</w:t>
+              <w:t>Finalizado</w:t>
             </w:r>
           </w:p>
         </w:tc>
@@ -3368,15 +3365,13 @@
               </w:rPr>
               <w:t xml:space="preserve">   El botón eliminar debe estar presente en la columna de </w:t>
             </w:r>
-            <w:proofErr w:type="gramStart"/>
-            <w:r>
-              <w:rPr>
-                <w:sz w:val="24"/>
-                <w:szCs w:val="24"/>
-              </w:rPr>
-              <w:t>acciones  para</w:t>
-            </w:r>
-            <w:proofErr w:type="gramEnd"/>
+            <w:r>
+              <w:rPr>
+                <w:sz w:val="24"/>
+                <w:szCs w:val="24"/>
+              </w:rPr>
+              <w:t>acciones para</w:t>
+            </w:r>
             <w:r>
               <w:rPr>
                 <w:sz w:val="24"/>
@@ -3742,10 +3737,12 @@
             </w:pPr>
             <w:r>
               <w:rPr>
-                <w:sz w:val="24"/>
-                <w:szCs w:val="24"/>
-              </w:rPr>
-              <w:t>pendiente</w:t>
+                <w:b/>
+                <w:bCs/>
+                <w:sz w:val="24"/>
+                <w:szCs w:val="24"/>
+              </w:rPr>
+              <w:t>Finalizado</w:t>
             </w:r>
           </w:p>
         </w:tc>
@@ -3936,11 +3933,13 @@
             </w:pPr>
             <w:r>
               <w:rPr>
+                <w:b/>
+                <w:bCs/>
                 <w:sz w:val="24"/>
                 <w:szCs w:val="24"/>
               </w:rPr>
               <w:lastRenderedPageBreak/>
-              <w:t>pendiente</w:t>
+              <w:t>Finalizado</w:t>
             </w:r>
           </w:p>
         </w:tc>
@@ -4342,15 +4341,13 @@
               </w:rPr>
               <w:t xml:space="preserve">   El botón actualizar debe estar presente en la columna de </w:t>
             </w:r>
-            <w:proofErr w:type="gramStart"/>
-            <w:r>
-              <w:rPr>
-                <w:sz w:val="24"/>
-                <w:szCs w:val="24"/>
-              </w:rPr>
-              <w:t>acciones  para</w:t>
-            </w:r>
-            <w:proofErr w:type="gramEnd"/>
+            <w:r>
+              <w:rPr>
+                <w:sz w:val="24"/>
+                <w:szCs w:val="24"/>
+              </w:rPr>
+              <w:t>acciones para</w:t>
+            </w:r>
             <w:r>
               <w:rPr>
                 <w:sz w:val="24"/>
@@ -5760,7 +5757,7 @@
               </wp:anchor>
             </w:drawing>
           </mc:Choice>
-          <mc:Fallback xmlns:cr="http://schemas.microsoft.com/office/comments/2020/reactions" xmlns="http://schemas.microsoft.com/office/tasks/2019/documenttasks" xmlns:dgm="http://schemas.openxmlformats.org/drawingml/2006/diagram" xmlns:lc="http://schemas.openxmlformats.org/drawingml/2006/lockedCanvas" xmlns:c="http://schemas.openxmlformats.org/drawingml/2006/chart" xmlns:pic="http://schemas.openxmlformats.org/drawingml/2006/picture" xmlns:a="http://schemas.openxmlformats.org/drawingml/2006/main" xmlns:sl="http://schemas.openxmlformats.org/schemaLibrary/2006/main">
+          <mc:Fallback xmlns:sl="http://schemas.openxmlformats.org/schemaLibrary/2006/main" xmlns:a="http://schemas.openxmlformats.org/drawingml/2006/main" xmlns:pic="http://schemas.openxmlformats.org/drawingml/2006/picture" xmlns:c="http://schemas.openxmlformats.org/drawingml/2006/chart" xmlns:lc="http://schemas.openxmlformats.org/drawingml/2006/lockedCanvas" xmlns:dgm="http://schemas.openxmlformats.org/drawingml/2006/diagram" xmlns="http://schemas.microsoft.com/office/tasks/2019/documenttasks" xmlns:cr="http://schemas.microsoft.com/office/comments/2020/reactions">
             <w:drawing>
               <wp:anchor allowOverlap="1" behindDoc="1" distB="0" distT="0" distL="0" distR="0" hidden="0" layoutInCell="1" locked="0" relativeHeight="0" simplePos="0">
                 <wp:simplePos x="0" y="0"/>
@@ -6217,7 +6214,7 @@
             </wp:anchor>
           </w:drawing>
         </mc:Choice>
-        <mc:Fallback xmlns:cr="http://schemas.microsoft.com/office/comments/2020/reactions" xmlns="http://schemas.microsoft.com/office/tasks/2019/documenttasks" xmlns:dgm="http://schemas.openxmlformats.org/drawingml/2006/diagram" xmlns:lc="http://schemas.openxmlformats.org/drawingml/2006/lockedCanvas" xmlns:c="http://schemas.openxmlformats.org/drawingml/2006/chart" xmlns:pic="http://schemas.openxmlformats.org/drawingml/2006/picture" xmlns:a="http://schemas.openxmlformats.org/drawingml/2006/main" xmlns:sl="http://schemas.openxmlformats.org/schemaLibrary/2006/main">
+        <mc:Fallback xmlns:sl="http://schemas.openxmlformats.org/schemaLibrary/2006/main" xmlns:a="http://schemas.openxmlformats.org/drawingml/2006/main" xmlns:pic="http://schemas.openxmlformats.org/drawingml/2006/picture" xmlns:c="http://schemas.openxmlformats.org/drawingml/2006/chart" xmlns:lc="http://schemas.openxmlformats.org/drawingml/2006/lockedCanvas" xmlns:dgm="http://schemas.openxmlformats.org/drawingml/2006/diagram" xmlns="http://schemas.microsoft.com/office/tasks/2019/documenttasks" xmlns:cr="http://schemas.microsoft.com/office/comments/2020/reactions">
           <w:drawing>
             <wp:anchor allowOverlap="1" behindDoc="1" distB="0" distT="0" distL="0" distR="0" hidden="0" layoutInCell="1" locked="0" relativeHeight="0" simplePos="0">
               <wp:simplePos x="0" y="0"/>

</xml_diff>

<commit_message>
16-04-2025 | Daily 04 - Sprint 3 | Actualización de Casos de Uso
- Agregado el documento detallado correspondiente al Daily 4.
- Actualizados los casos de uso aceptados hasta el Daily 4, reflejando el progreso del sprint.
</commit_message>
<xml_diff>
--- a/docs/documentacion/Sprint_3/Casos de Prueba - Aceptados Sprint 3.docx
+++ b/docs/documentacion/Sprint_3/Casos de Prueba - Aceptados Sprint 3.docx
@@ -55,18 +55,8 @@
           <w:sz w:val="24"/>
           <w:u w:val="single"/>
         </w:rPr>
-        <w:t xml:space="preserve"> y </w:t>
+        <w:t xml:space="preserve"> y Snayder</w:t>
       </w:r>
-      <w:proofErr w:type="spellStart"/>
-      <w:r>
-        <w:rPr>
-          <w:b/>
-          <w:sz w:val="24"/>
-          <w:u w:val="single"/>
-        </w:rPr>
-        <w:t>Snayder</w:t>
-      </w:r>
-      <w:proofErr w:type="spellEnd"/>
     </w:p>
     <w:p>
       <w:pPr>
@@ -1840,15 +1830,13 @@
               </w:rPr>
               <w:t xml:space="preserve">Seleccionar el botón de anular venta que tenga </w:t>
             </w:r>
-            <w:proofErr w:type="spellStart"/>
-            <w:r>
-              <w:rPr>
-                <w:sz w:val="24"/>
-                <w:szCs w:val="24"/>
-              </w:rPr>
-              <w:t>credito</w:t>
-            </w:r>
-            <w:proofErr w:type="spellEnd"/>
+            <w:r>
+              <w:rPr>
+                <w:sz w:val="24"/>
+                <w:szCs w:val="24"/>
+              </w:rPr>
+              <w:t>crédito</w:t>
+            </w:r>
           </w:p>
           <w:p>
             <w:pPr>
@@ -1908,10 +1896,12 @@
             </w:pPr>
             <w:r>
               <w:rPr>
-                <w:sz w:val="24"/>
-                <w:szCs w:val="24"/>
-              </w:rPr>
-              <w:t>Pendiente</w:t>
+                <w:b/>
+                <w:bCs/>
+                <w:sz w:val="24"/>
+                <w:szCs w:val="24"/>
+              </w:rPr>
+              <w:t>Finalizado</w:t>
             </w:r>
           </w:p>
         </w:tc>
@@ -5126,11 +5116,13 @@
             </w:pPr>
             <w:r>
               <w:rPr>
+                <w:b/>
+                <w:bCs/>
                 <w:sz w:val="24"/>
                 <w:szCs w:val="24"/>
               </w:rPr>
               <w:lastRenderedPageBreak/>
-              <w:t>Pendiente</w:t>
+              <w:t>Finalizado</w:t>
             </w:r>
           </w:p>
         </w:tc>
@@ -8414,7 +8406,7 @@
   <w:abstractNum w:abstractNumId="19" w15:restartNumberingAfterBreak="0">
     <w:nsid w:val="453D6A8A"/>
     <w:multiLevelType w:val="multilevel"/>
-    <w:tmpl w:val="D85837D8"/>
+    <w:tmpl w:val="FBB049D2"/>
     <w:lvl w:ilvl="0">
       <w:start w:val="1"/>
       <w:numFmt w:val="decimal"/>
@@ -8424,10 +8416,10 @@
         <w:ind w:left="720" w:hanging="360"/>
       </w:pPr>
       <w:rPr>
-        <w:rFonts w:ascii="Arial" w:eastAsia="Arial" w:hAnsi="Arial" w:cs="Arial"/>
-        <w:color w:val="BFC1C4"/>
-        <w:sz w:val="21"/>
-        <w:szCs w:val="21"/>
+        <w:rFonts w:ascii="Times New Roman" w:eastAsia="Arial" w:hAnsi="Times New Roman" w:cs="Times New Roman" w:hint="default"/>
+        <w:color w:val="auto"/>
+        <w:sz w:val="24"/>
+        <w:szCs w:val="24"/>
         <w:u w:val="none"/>
       </w:rPr>
     </w:lvl>
@@ -11796,6 +11788,7 @@
   <w:style w:type="character" w:default="1" w:styleId="Fuentedeprrafopredeter">
     <w:name w:val="Default Paragraph Font"/>
     <w:uiPriority w:val="1"/>
+    <w:semiHidden/>
     <w:unhideWhenUsed/>
   </w:style>
   <w:style w:type="table" w:default="1" w:styleId="Tablanormal">

</xml_diff>

<commit_message>
18-04-2025 | Daily 05 - Sprint 3 | Actualización de Casos de Uso
- Agregado el documento detallado correspondiente al Daily 5.
- Actualizados los casos de uso aceptados hasta el Daily 5, reflejando el progreso del sprint.
</commit_message>
<xml_diff>
--- a/docs/documentacion/Sprint_3/Casos de Prueba - Aceptados Sprint 3.docx
+++ b/docs/documentacion/Sprint_3/Casos de Prueba - Aceptados Sprint 3.docx
@@ -4898,10 +4898,12 @@
             </w:pPr>
             <w:r>
               <w:rPr>
-                <w:sz w:val="24"/>
-                <w:szCs w:val="24"/>
-              </w:rPr>
-              <w:t>Pendiente</w:t>
+                <w:b/>
+                <w:bCs/>
+                <w:sz w:val="24"/>
+                <w:szCs w:val="24"/>
+              </w:rPr>
+              <w:t>Finalizado</w:t>
             </w:r>
           </w:p>
         </w:tc>
@@ -5749,7 +5751,7 @@
               </wp:anchor>
             </w:drawing>
           </mc:Choice>
-          <mc:Fallback xmlns:sl="http://schemas.openxmlformats.org/schemaLibrary/2006/main" xmlns:a="http://schemas.openxmlformats.org/drawingml/2006/main" xmlns:pic="http://schemas.openxmlformats.org/drawingml/2006/picture" xmlns:c="http://schemas.openxmlformats.org/drawingml/2006/chart" xmlns:lc="http://schemas.openxmlformats.org/drawingml/2006/lockedCanvas" xmlns:dgm="http://schemas.openxmlformats.org/drawingml/2006/diagram" xmlns="http://schemas.microsoft.com/office/tasks/2019/documenttasks" xmlns:cr="http://schemas.microsoft.com/office/comments/2020/reactions">
+          <mc:Fallback xmlns:cr="http://schemas.microsoft.com/office/comments/2020/reactions" xmlns="http://schemas.microsoft.com/office/tasks/2019/documenttasks" xmlns:dgm="http://schemas.openxmlformats.org/drawingml/2006/diagram" xmlns:lc="http://schemas.openxmlformats.org/drawingml/2006/lockedCanvas" xmlns:c="http://schemas.openxmlformats.org/drawingml/2006/chart" xmlns:pic="http://schemas.openxmlformats.org/drawingml/2006/picture" xmlns:a="http://schemas.openxmlformats.org/drawingml/2006/main" xmlns:sl="http://schemas.openxmlformats.org/schemaLibrary/2006/main">
             <w:drawing>
               <wp:anchor allowOverlap="1" behindDoc="1" distB="0" distT="0" distL="0" distR="0" hidden="0" layoutInCell="1" locked="0" relativeHeight="0" simplePos="0">
                 <wp:simplePos x="0" y="0"/>
@@ -6206,7 +6208,7 @@
             </wp:anchor>
           </w:drawing>
         </mc:Choice>
-        <mc:Fallback xmlns:sl="http://schemas.openxmlformats.org/schemaLibrary/2006/main" xmlns:a="http://schemas.openxmlformats.org/drawingml/2006/main" xmlns:pic="http://schemas.openxmlformats.org/drawingml/2006/picture" xmlns:c="http://schemas.openxmlformats.org/drawingml/2006/chart" xmlns:lc="http://schemas.openxmlformats.org/drawingml/2006/lockedCanvas" xmlns:dgm="http://schemas.openxmlformats.org/drawingml/2006/diagram" xmlns="http://schemas.microsoft.com/office/tasks/2019/documenttasks" xmlns:cr="http://schemas.microsoft.com/office/comments/2020/reactions">
+        <mc:Fallback xmlns:cr="http://schemas.microsoft.com/office/comments/2020/reactions" xmlns="http://schemas.microsoft.com/office/tasks/2019/documenttasks" xmlns:dgm="http://schemas.openxmlformats.org/drawingml/2006/diagram" xmlns:lc="http://schemas.openxmlformats.org/drawingml/2006/lockedCanvas" xmlns:c="http://schemas.openxmlformats.org/drawingml/2006/chart" xmlns:pic="http://schemas.openxmlformats.org/drawingml/2006/picture" xmlns:a="http://schemas.openxmlformats.org/drawingml/2006/main" xmlns:sl="http://schemas.openxmlformats.org/schemaLibrary/2006/main">
           <w:drawing>
             <wp:anchor allowOverlap="1" behindDoc="1" distB="0" distT="0" distL="0" distR="0" hidden="0" layoutInCell="1" locked="0" relativeHeight="0" simplePos="0">
               <wp:simplePos x="0" y="0"/>

</xml_diff>

<commit_message>
2025-04-20 | Finalización Sprint 3 | Actualización de Casos de Uso
- Se actualizaron los casos de uso aceptados al cierre del Sprint 3, reflejando el progreso alcanzado.
- Nota: Los documentos correspondientes al Sprint Review y Sprint Retrospective no se han subido en esta fecha. Debido a que es Semana Santa, el cliente no pudo reunirse el domingo 20 de abril para realizar la revisión del sprint, lo que también retrasó la realización de la retrospectiva.
Estos documentos se incluirán en la documentación del proyecto mañana, lunes 21 de abril de 2025, una vez realizada la reunión pendiente.
</commit_message>
<xml_diff>
--- a/docs/documentacion/Sprint_3/Casos de Prueba - Aceptados Sprint 3.docx
+++ b/docs/documentacion/Sprint_3/Casos de Prueba - Aceptados Sprint 3.docx
@@ -3387,10 +3387,12 @@
             </w:pPr>
             <w:r>
               <w:rPr>
-                <w:sz w:val="24"/>
-                <w:szCs w:val="24"/>
-              </w:rPr>
-              <w:t>Pendiente</w:t>
+                <w:b/>
+                <w:bCs/>
+                <w:sz w:val="24"/>
+                <w:szCs w:val="24"/>
+              </w:rPr>
+              <w:t>Finalizado</w:t>
             </w:r>
           </w:p>
         </w:tc>
@@ -3578,10 +3580,12 @@
             </w:pPr>
             <w:r>
               <w:rPr>
-                <w:sz w:val="24"/>
-                <w:szCs w:val="24"/>
-              </w:rPr>
-              <w:t>Pendiente</w:t>
+                <w:b/>
+                <w:bCs/>
+                <w:sz w:val="24"/>
+                <w:szCs w:val="24"/>
+              </w:rPr>
+              <w:t>Finalizado</w:t>
             </w:r>
           </w:p>
         </w:tc>
@@ -4362,10 +4366,12 @@
             </w:pPr>
             <w:r>
               <w:rPr>
-                <w:sz w:val="24"/>
-                <w:szCs w:val="24"/>
-              </w:rPr>
-              <w:t>Pendiente</w:t>
+                <w:b/>
+                <w:bCs/>
+                <w:sz w:val="24"/>
+                <w:szCs w:val="24"/>
+              </w:rPr>
+              <w:t>Finalizado</w:t>
             </w:r>
           </w:p>
         </w:tc>
@@ -4573,10 +4579,12 @@
             </w:pPr>
             <w:r>
               <w:rPr>
-                <w:sz w:val="24"/>
-                <w:szCs w:val="24"/>
-              </w:rPr>
-              <w:t>Pendiente</w:t>
+                <w:b/>
+                <w:bCs/>
+                <w:sz w:val="24"/>
+                <w:szCs w:val="24"/>
+              </w:rPr>
+              <w:t>Finalizado</w:t>
             </w:r>
           </w:p>
         </w:tc>
@@ -5751,7 +5759,7 @@
               </wp:anchor>
             </w:drawing>
           </mc:Choice>
-          <mc:Fallback xmlns:cr="http://schemas.microsoft.com/office/comments/2020/reactions" xmlns="http://schemas.microsoft.com/office/tasks/2019/documenttasks" xmlns:dgm="http://schemas.openxmlformats.org/drawingml/2006/diagram" xmlns:lc="http://schemas.openxmlformats.org/drawingml/2006/lockedCanvas" xmlns:c="http://schemas.openxmlformats.org/drawingml/2006/chart" xmlns:pic="http://schemas.openxmlformats.org/drawingml/2006/picture" xmlns:a="http://schemas.openxmlformats.org/drawingml/2006/main" xmlns:sl="http://schemas.openxmlformats.org/schemaLibrary/2006/main">
+          <mc:Fallback xmlns:sl="http://schemas.openxmlformats.org/schemaLibrary/2006/main" xmlns:a="http://schemas.openxmlformats.org/drawingml/2006/main" xmlns:pic="http://schemas.openxmlformats.org/drawingml/2006/picture" xmlns:c="http://schemas.openxmlformats.org/drawingml/2006/chart" xmlns:lc="http://schemas.openxmlformats.org/drawingml/2006/lockedCanvas" xmlns:dgm="http://schemas.openxmlformats.org/drawingml/2006/diagram" xmlns="http://schemas.microsoft.com/office/tasks/2019/documenttasks" xmlns:cr="http://schemas.microsoft.com/office/comments/2020/reactions">
             <w:drawing>
               <wp:anchor allowOverlap="1" behindDoc="1" distB="0" distT="0" distL="0" distR="0" hidden="0" layoutInCell="1" locked="0" relativeHeight="0" simplePos="0">
                 <wp:simplePos x="0" y="0"/>
@@ -6208,7 +6216,7 @@
             </wp:anchor>
           </w:drawing>
         </mc:Choice>
-        <mc:Fallback xmlns:cr="http://schemas.microsoft.com/office/comments/2020/reactions" xmlns="http://schemas.microsoft.com/office/tasks/2019/documenttasks" xmlns:dgm="http://schemas.openxmlformats.org/drawingml/2006/diagram" xmlns:lc="http://schemas.openxmlformats.org/drawingml/2006/lockedCanvas" xmlns:c="http://schemas.openxmlformats.org/drawingml/2006/chart" xmlns:pic="http://schemas.openxmlformats.org/drawingml/2006/picture" xmlns:a="http://schemas.openxmlformats.org/drawingml/2006/main" xmlns:sl="http://schemas.openxmlformats.org/schemaLibrary/2006/main">
+        <mc:Fallback xmlns:sl="http://schemas.openxmlformats.org/schemaLibrary/2006/main" xmlns:a="http://schemas.openxmlformats.org/drawingml/2006/main" xmlns:pic="http://schemas.openxmlformats.org/drawingml/2006/picture" xmlns:c="http://schemas.openxmlformats.org/drawingml/2006/chart" xmlns:lc="http://schemas.openxmlformats.org/drawingml/2006/lockedCanvas" xmlns:dgm="http://schemas.openxmlformats.org/drawingml/2006/diagram" xmlns="http://schemas.microsoft.com/office/tasks/2019/documenttasks" xmlns:cr="http://schemas.microsoft.com/office/comments/2020/reactions">
           <w:drawing>
             <wp:anchor allowOverlap="1" behindDoc="1" distB="0" distT="0" distL="0" distR="0" hidden="0" layoutInCell="1" locked="0" relativeHeight="0" simplePos="0">
               <wp:simplePos x="0" y="0"/>

</xml_diff>